<commit_message>
Add the mentor presentation and drop Appendix B from the report
- QGenomix_Mentor_Presentation.pptx: 17 slides with speaker notes and native charts, built from
  results/ by docs/presentation/build_deck.js
- Mentor report: Appendix B (plagiarism report placeholder) removed; contents updated
</commit_message>
<xml_diff>
--- a/QGenomix_Mentor_Evaluation_Report.docx
+++ b/QGenomix_Mentor_Evaluation_Report.docx
@@ -2614,7 +2614,7 @@
           <w:sz w:val="22"/>
           <w:szCs w:val="22"/>
         </w:rPr>
-        <w:t xml:space="preserve">APPENDIX B: PLAGIARISM REPORT</w:t>
+        <w:t xml:space="preserve">MENTOR'S REMARKS</w:t>
       </w:r>
       <w:r>
         <w:rPr>
@@ -2622,31 +2622,6 @@
           <w:szCs w:val="22"/>
         </w:rPr>
         <w:t xml:space="preserve">	30</w:t>
-      </w:r>
-    </w:p>
-    <w:p>
-      <w:pPr>
-        <w:tabs>
-          <w:tab w:val="right" w:pos="9386" w:leader="dot"/>
-        </w:tabs>
-        <w:spacing w:after="80" w:before="80"/>
-        <w:ind w:left="0"/>
-      </w:pPr>
-      <w:r>
-        <w:rPr>
-          <w:b/>
-          <w:bCs/>
-          <w:sz w:val="22"/>
-          <w:szCs w:val="22"/>
-        </w:rPr>
-        <w:t xml:space="preserve">MENTOR'S REMARKS</w:t>
-      </w:r>
-      <w:r>
-        <w:rPr>
-          <w:sz w:val="22"/>
-          <w:szCs w:val="22"/>
-        </w:rPr>
-        <w:t xml:space="preserve">	31</w:t>
       </w:r>
     </w:p>
     <w:p>
@@ -27618,24 +27593,6 @@
           <w:szCs w:val="22"/>
         </w:rPr>
         <w:t xml:space="preserve">A. Ramachandran, C. Snehalatha, S. Mary, B. Mukesh, A. D. Bhaskar and V. Vijay, "The Indian Diabetes Prevention Programme shows that lifestyle modification and metformin prevent type 2 diabetes in Asian Indian subjects with impaired glucose tolerance (IDPP-1)," Diabetologia, vol. 49, pp. 289–297, 2006.</w:t>
-      </w:r>
-    </w:p>
-    <w:p>
-      <w:pPr>
-        <w:pStyle w:val="Heading1"/>
-        <w:pageBreakBefore/>
-      </w:pPr>
-      <w:r>
-        <w:t xml:space="preserve">APPENDIX B: PLAGIARISM REPORT</w:t>
-      </w:r>
-    </w:p>
-    <w:p>
-      <w:pPr>
-        <w:spacing w:after="120" w:before="0" w:line="276"/>
-        <w:jc w:val="both"/>
-      </w:pPr>
-      <w:r>
-        <w:t xml:space="preserve">Plagiarism report to be attached here after Turnitin submission.</w:t>
       </w:r>
     </w:p>
     <w:p>

</xml_diff>